<commit_message>
data updates for all 10 days
</commit_message>
<xml_diff>
--- a/data/ALL WEIGHT MEASUREMENTS.docx
+++ b/data/ALL WEIGHT MEASUREMENTS.docx
@@ -10,7 +10,7 @@
         <w:rPr>
           <w:rtl w:val="0"/>
         </w:rPr>
-        <w:t xml:space="preserve">Sorry, I initially forgot to weigh them. The plants were put in the fridge around 6pm EST Saturday 10/18/2025. They were weighed approximately 6 hours later.</w:t>
+        <w:t xml:space="preserve">Experiment Started 6:00pm EST Saturday 10/18/2025. Experiment Ended 11:59pm EST Tuesday 10/28/2025.</w:t>
       </w:r>
     </w:p>
     <w:p>
@@ -268,7 +268,7 @@
               <w:rPr>
                 <w:rtl w:val="0"/>
               </w:rPr>
-              <w:t xml:space="preserve">4</w:t>
+              <w:t xml:space="preserve">2</w:t>
             </w:r>
           </w:p>
         </w:tc>
@@ -306,7 +306,7 @@
               <w:rPr>
                 <w:rtl w:val="0"/>
               </w:rPr>
-              <w:t xml:space="preserve">2</w:t>
+              <w:t xml:space="preserve">4</w:t>
             </w:r>
           </w:p>
         </w:tc>
@@ -4594,30 +4594,32 @@
               <w:rPr>
                 <w:rtl w:val="0"/>
               </w:rPr>
-            </w:r>
-          </w:p>
-        </w:tc>
-        <w:tc>
-          <w:tcPr>
-            <w:shd w:fill="auto" w:val="clear"/>
-            <w:tcMar>
-              <w:top w:w="100.0" w:type="dxa"/>
-              <w:left w:w="100.0" w:type="dxa"/>
-              <w:bottom w:w="100.0" w:type="dxa"/>
-              <w:right w:w="100.0" w:type="dxa"/>
-            </w:tcMar>
-            <w:vAlign w:val="top"/>
-          </w:tcPr>
-          <w:p>
-            <w:pPr>
-              <w:widowControl w:val="0"/>
-              <w:spacing w:line="240" w:lineRule="auto"/>
-              <w:rPr/>
-            </w:pPr>
-            <w:r>
-              <w:rPr>
-                <w:rtl w:val="0"/>
-              </w:rPr>
+              <w:t xml:space="preserve">0</w:t>
+            </w:r>
+          </w:p>
+        </w:tc>
+        <w:tc>
+          <w:tcPr>
+            <w:shd w:fill="auto" w:val="clear"/>
+            <w:tcMar>
+              <w:top w:w="100.0" w:type="dxa"/>
+              <w:left w:w="100.0" w:type="dxa"/>
+              <w:bottom w:w="100.0" w:type="dxa"/>
+              <w:right w:w="100.0" w:type="dxa"/>
+            </w:tcMar>
+            <w:vAlign w:val="top"/>
+          </w:tcPr>
+          <w:p>
+            <w:pPr>
+              <w:widowControl w:val="0"/>
+              <w:spacing w:line="240" w:lineRule="auto"/>
+              <w:rPr/>
+            </w:pPr>
+            <w:r>
+              <w:rPr>
+                <w:rtl w:val="0"/>
+              </w:rPr>
+              <w:t xml:space="preserve">?</w:t>
             </w:r>
           </w:p>
         </w:tc>
@@ -4673,30 +4675,32 @@
               <w:rPr>
                 <w:rtl w:val="0"/>
               </w:rPr>
-            </w:r>
-          </w:p>
-        </w:tc>
-        <w:tc>
-          <w:tcPr>
-            <w:shd w:fill="auto" w:val="clear"/>
-            <w:tcMar>
-              <w:top w:w="100.0" w:type="dxa"/>
-              <w:left w:w="100.0" w:type="dxa"/>
-              <w:bottom w:w="100.0" w:type="dxa"/>
-              <w:right w:w="100.0" w:type="dxa"/>
-            </w:tcMar>
-            <w:vAlign w:val="top"/>
-          </w:tcPr>
-          <w:p>
-            <w:pPr>
-              <w:widowControl w:val="0"/>
-              <w:spacing w:line="240" w:lineRule="auto"/>
-              <w:rPr/>
-            </w:pPr>
-            <w:r>
-              <w:rPr>
-                <w:rtl w:val="0"/>
-              </w:rPr>
+              <w:t xml:space="preserve">0</w:t>
+            </w:r>
+          </w:p>
+        </w:tc>
+        <w:tc>
+          <w:tcPr>
+            <w:shd w:fill="auto" w:val="clear"/>
+            <w:tcMar>
+              <w:top w:w="100.0" w:type="dxa"/>
+              <w:left w:w="100.0" w:type="dxa"/>
+              <w:bottom w:w="100.0" w:type="dxa"/>
+              <w:right w:w="100.0" w:type="dxa"/>
+            </w:tcMar>
+            <w:vAlign w:val="top"/>
+          </w:tcPr>
+          <w:p>
+            <w:pPr>
+              <w:widowControl w:val="0"/>
+              <w:spacing w:line="240" w:lineRule="auto"/>
+              <w:rPr/>
+            </w:pPr>
+            <w:r>
+              <w:rPr>
+                <w:rtl w:val="0"/>
+              </w:rPr>
+              <w:t xml:space="preserve">5</w:t>
             </w:r>
           </w:p>
         </w:tc>
@@ -4752,30 +4756,32 @@
               <w:rPr>
                 <w:rtl w:val="0"/>
               </w:rPr>
-            </w:r>
-          </w:p>
-        </w:tc>
-        <w:tc>
-          <w:tcPr>
-            <w:shd w:fill="auto" w:val="clear"/>
-            <w:tcMar>
-              <w:top w:w="100.0" w:type="dxa"/>
-              <w:left w:w="100.0" w:type="dxa"/>
-              <w:bottom w:w="100.0" w:type="dxa"/>
-              <w:right w:w="100.0" w:type="dxa"/>
-            </w:tcMar>
-            <w:vAlign w:val="top"/>
-          </w:tcPr>
-          <w:p>
-            <w:pPr>
-              <w:widowControl w:val="0"/>
-              <w:spacing w:line="240" w:lineRule="auto"/>
-              <w:rPr/>
-            </w:pPr>
-            <w:r>
-              <w:rPr>
-                <w:rtl w:val="0"/>
-              </w:rPr>
+              <w:t xml:space="preserve">0</w:t>
+            </w:r>
+          </w:p>
+        </w:tc>
+        <w:tc>
+          <w:tcPr>
+            <w:shd w:fill="auto" w:val="clear"/>
+            <w:tcMar>
+              <w:top w:w="100.0" w:type="dxa"/>
+              <w:left w:w="100.0" w:type="dxa"/>
+              <w:bottom w:w="100.0" w:type="dxa"/>
+              <w:right w:w="100.0" w:type="dxa"/>
+            </w:tcMar>
+            <w:vAlign w:val="top"/>
+          </w:tcPr>
+          <w:p>
+            <w:pPr>
+              <w:widowControl w:val="0"/>
+              <w:spacing w:line="240" w:lineRule="auto"/>
+              <w:rPr/>
+            </w:pPr>
+            <w:r>
+              <w:rPr>
+                <w:rtl w:val="0"/>
+              </w:rPr>
+              <w:t xml:space="preserve">3</w:t>
             </w:r>
           </w:p>
         </w:tc>
@@ -4831,30 +4837,32 @@
               <w:rPr>
                 <w:rtl w:val="0"/>
               </w:rPr>
-            </w:r>
-          </w:p>
-        </w:tc>
-        <w:tc>
-          <w:tcPr>
-            <w:shd w:fill="auto" w:val="clear"/>
-            <w:tcMar>
-              <w:top w:w="100.0" w:type="dxa"/>
-              <w:left w:w="100.0" w:type="dxa"/>
-              <w:bottom w:w="100.0" w:type="dxa"/>
-              <w:right w:w="100.0" w:type="dxa"/>
-            </w:tcMar>
-            <w:vAlign w:val="top"/>
-          </w:tcPr>
-          <w:p>
-            <w:pPr>
-              <w:widowControl w:val="0"/>
-              <w:spacing w:line="240" w:lineRule="auto"/>
-              <w:rPr/>
-            </w:pPr>
-            <w:r>
-              <w:rPr>
-                <w:rtl w:val="0"/>
-              </w:rPr>
+              <w:t xml:space="preserve">0</w:t>
+            </w:r>
+          </w:p>
+        </w:tc>
+        <w:tc>
+          <w:tcPr>
+            <w:shd w:fill="auto" w:val="clear"/>
+            <w:tcMar>
+              <w:top w:w="100.0" w:type="dxa"/>
+              <w:left w:w="100.0" w:type="dxa"/>
+              <w:bottom w:w="100.0" w:type="dxa"/>
+              <w:right w:w="100.0" w:type="dxa"/>
+            </w:tcMar>
+            <w:vAlign w:val="top"/>
+          </w:tcPr>
+          <w:p>
+            <w:pPr>
+              <w:widowControl w:val="0"/>
+              <w:spacing w:line="240" w:lineRule="auto"/>
+              <w:rPr/>
+            </w:pPr>
+            <w:r>
+              <w:rPr>
+                <w:rtl w:val="0"/>
+              </w:rPr>
+              <w:t xml:space="preserve">3</w:t>
             </w:r>
           </w:p>
         </w:tc>
@@ -4878,7 +4886,7 @@
         <w:rPr>
           <w:rtl w:val="0"/>
         </w:rPr>
-        <w:t xml:space="preserve">Day 10 - Tuesday 10/28/2025</w:t>
+        <w:t xml:space="preserve">Day 10 (LAST DAY) - Tuesday 10/28/2025</w:t>
       </w:r>
     </w:p>
     <w:p>
@@ -5050,30 +5058,32 @@
               <w:rPr>
                 <w:rtl w:val="0"/>
               </w:rPr>
-            </w:r>
-          </w:p>
-        </w:tc>
-        <w:tc>
-          <w:tcPr>
-            <w:shd w:fill="auto" w:val="clear"/>
-            <w:tcMar>
-              <w:top w:w="100.0" w:type="dxa"/>
-              <w:left w:w="100.0" w:type="dxa"/>
-              <w:bottom w:w="100.0" w:type="dxa"/>
-              <w:right w:w="100.0" w:type="dxa"/>
-            </w:tcMar>
-            <w:vAlign w:val="top"/>
-          </w:tcPr>
-          <w:p>
-            <w:pPr>
-              <w:widowControl w:val="0"/>
-              <w:spacing w:line="240" w:lineRule="auto"/>
-              <w:rPr/>
-            </w:pPr>
-            <w:r>
-              <w:rPr>
-                <w:rtl w:val="0"/>
-              </w:rPr>
+              <w:t xml:space="preserve">0</w:t>
+            </w:r>
+          </w:p>
+        </w:tc>
+        <w:tc>
+          <w:tcPr>
+            <w:shd w:fill="auto" w:val="clear"/>
+            <w:tcMar>
+              <w:top w:w="100.0" w:type="dxa"/>
+              <w:left w:w="100.0" w:type="dxa"/>
+              <w:bottom w:w="100.0" w:type="dxa"/>
+              <w:right w:w="100.0" w:type="dxa"/>
+            </w:tcMar>
+            <w:vAlign w:val="top"/>
+          </w:tcPr>
+          <w:p>
+            <w:pPr>
+              <w:widowControl w:val="0"/>
+              <w:spacing w:line="240" w:lineRule="auto"/>
+              <w:rPr/>
+            </w:pPr>
+            <w:r>
+              <w:rPr>
+                <w:rtl w:val="0"/>
+              </w:rPr>
+              <w:t xml:space="preserve">?</w:t>
             </w:r>
           </w:p>
         </w:tc>
@@ -5129,30 +5139,32 @@
               <w:rPr>
                 <w:rtl w:val="0"/>
               </w:rPr>
-            </w:r>
-          </w:p>
-        </w:tc>
-        <w:tc>
-          <w:tcPr>
-            <w:shd w:fill="auto" w:val="clear"/>
-            <w:tcMar>
-              <w:top w:w="100.0" w:type="dxa"/>
-              <w:left w:w="100.0" w:type="dxa"/>
-              <w:bottom w:w="100.0" w:type="dxa"/>
-              <w:right w:w="100.0" w:type="dxa"/>
-            </w:tcMar>
-            <w:vAlign w:val="top"/>
-          </w:tcPr>
-          <w:p>
-            <w:pPr>
-              <w:widowControl w:val="0"/>
-              <w:spacing w:line="240" w:lineRule="auto"/>
-              <w:rPr/>
-            </w:pPr>
-            <w:r>
-              <w:rPr>
-                <w:rtl w:val="0"/>
-              </w:rPr>
+              <w:t xml:space="preserve">0</w:t>
+            </w:r>
+          </w:p>
+        </w:tc>
+        <w:tc>
+          <w:tcPr>
+            <w:shd w:fill="auto" w:val="clear"/>
+            <w:tcMar>
+              <w:top w:w="100.0" w:type="dxa"/>
+              <w:left w:w="100.0" w:type="dxa"/>
+              <w:bottom w:w="100.0" w:type="dxa"/>
+              <w:right w:w="100.0" w:type="dxa"/>
+            </w:tcMar>
+            <w:vAlign w:val="top"/>
+          </w:tcPr>
+          <w:p>
+            <w:pPr>
+              <w:widowControl w:val="0"/>
+              <w:spacing w:line="240" w:lineRule="auto"/>
+              <w:rPr/>
+            </w:pPr>
+            <w:r>
+              <w:rPr>
+                <w:rtl w:val="0"/>
+              </w:rPr>
+              <w:t xml:space="preserve">5</w:t>
             </w:r>
           </w:p>
         </w:tc>
@@ -5208,30 +5220,32 @@
               <w:rPr>
                 <w:rtl w:val="0"/>
               </w:rPr>
-            </w:r>
-          </w:p>
-        </w:tc>
-        <w:tc>
-          <w:tcPr>
-            <w:shd w:fill="auto" w:val="clear"/>
-            <w:tcMar>
-              <w:top w:w="100.0" w:type="dxa"/>
-              <w:left w:w="100.0" w:type="dxa"/>
-              <w:bottom w:w="100.0" w:type="dxa"/>
-              <w:right w:w="100.0" w:type="dxa"/>
-            </w:tcMar>
-            <w:vAlign w:val="top"/>
-          </w:tcPr>
-          <w:p>
-            <w:pPr>
-              <w:widowControl w:val="0"/>
-              <w:spacing w:line="240" w:lineRule="auto"/>
-              <w:rPr/>
-            </w:pPr>
-            <w:r>
-              <w:rPr>
-                <w:rtl w:val="0"/>
-              </w:rPr>
+              <w:t xml:space="preserve">0</w:t>
+            </w:r>
+          </w:p>
+        </w:tc>
+        <w:tc>
+          <w:tcPr>
+            <w:shd w:fill="auto" w:val="clear"/>
+            <w:tcMar>
+              <w:top w:w="100.0" w:type="dxa"/>
+              <w:left w:w="100.0" w:type="dxa"/>
+              <w:bottom w:w="100.0" w:type="dxa"/>
+              <w:right w:w="100.0" w:type="dxa"/>
+            </w:tcMar>
+            <w:vAlign w:val="top"/>
+          </w:tcPr>
+          <w:p>
+            <w:pPr>
+              <w:widowControl w:val="0"/>
+              <w:spacing w:line="240" w:lineRule="auto"/>
+              <w:rPr/>
+            </w:pPr>
+            <w:r>
+              <w:rPr>
+                <w:rtl w:val="0"/>
+              </w:rPr>
+              <w:t xml:space="preserve">3</w:t>
             </w:r>
           </w:p>
         </w:tc>
@@ -5287,30 +5301,32 @@
               <w:rPr>
                 <w:rtl w:val="0"/>
               </w:rPr>
-            </w:r>
-          </w:p>
-        </w:tc>
-        <w:tc>
-          <w:tcPr>
-            <w:shd w:fill="auto" w:val="clear"/>
-            <w:tcMar>
-              <w:top w:w="100.0" w:type="dxa"/>
-              <w:left w:w="100.0" w:type="dxa"/>
-              <w:bottom w:w="100.0" w:type="dxa"/>
-              <w:right w:w="100.0" w:type="dxa"/>
-            </w:tcMar>
-            <w:vAlign w:val="top"/>
-          </w:tcPr>
-          <w:p>
-            <w:pPr>
-              <w:widowControl w:val="0"/>
-              <w:spacing w:line="240" w:lineRule="auto"/>
-              <w:rPr/>
-            </w:pPr>
-            <w:r>
-              <w:rPr>
-                <w:rtl w:val="0"/>
-              </w:rPr>
+              <w:t xml:space="preserve">0</w:t>
+            </w:r>
+          </w:p>
+        </w:tc>
+        <w:tc>
+          <w:tcPr>
+            <w:shd w:fill="auto" w:val="clear"/>
+            <w:tcMar>
+              <w:top w:w="100.0" w:type="dxa"/>
+              <w:left w:w="100.0" w:type="dxa"/>
+              <w:bottom w:w="100.0" w:type="dxa"/>
+              <w:right w:w="100.0" w:type="dxa"/>
+            </w:tcMar>
+            <w:vAlign w:val="top"/>
+          </w:tcPr>
+          <w:p>
+            <w:pPr>
+              <w:widowControl w:val="0"/>
+              <w:spacing w:line="240" w:lineRule="auto"/>
+              <w:rPr/>
+            </w:pPr>
+            <w:r>
+              <w:rPr>
+                <w:rtl w:val="0"/>
+              </w:rPr>
+              <w:t xml:space="preserve">2</w:t>
             </w:r>
           </w:p>
         </w:tc>
@@ -5324,6 +5340,27 @@
         <w:rPr>
           <w:rtl w:val="0"/>
         </w:rPr>
+      </w:r>
+    </w:p>
+    <w:p>
+      <w:pPr>
+        <w:rPr/>
+      </w:pPr>
+      <w:r>
+        <w:rPr>
+          <w:rtl w:val="0"/>
+        </w:rPr>
+      </w:r>
+    </w:p>
+    <w:p>
+      <w:pPr>
+        <w:rPr/>
+      </w:pPr>
+      <w:r>
+        <w:rPr>
+          <w:rtl w:val="0"/>
+        </w:rPr>
+        <w:t xml:space="preserve">Special Day 10 Measurements: The sprigs are too big to be measured on the precise scale =/</w:t>
       </w:r>
     </w:p>
     <w:p>

</xml_diff>